<commit_message>
Update Assignment 5439: add JobSatisfaction regression analysis, metrics, executed notebook, and updated reports
</commit_message>
<xml_diff>
--- a/reports/Business_Interpretation_Report.docx
+++ b/reports/Business_Interpretation_Report.docx
@@ -539,6 +539,33 @@
         <w:t>The project demonstrates a credible screening model on a teaching dataset. Its main value is disciplined prioritization and measurement. Any real deployment requires current organizational data, human oversight, privacy review, and a controlled pilot that measures outcomes rather than assuming benefit.</w:t>
       </w:r>
     </w:p>
+    <w:p>
+      <w:pPr>
+        <w:pStyle w:val="Heading1"/>
+      </w:pPr>
+      <w:r>
+        <w:t>Optional Satisfaction-Modelling Check</w:t>
+      </w:r>
+    </w:p>
+    <w:p>
+      <w:r>
+        <w:t>A supplementary regression experiment tested whether JobSatisfaction could be predicted from the remaining employee fields. The best model, Random Forest Regressor, achieved MAE 0.970 and R² −0.027 on the held-out test set. The weak result means the dataset does not support dependable individual satisfaction predictions. Management should continue to measure satisfaction directly through surveys and conversations rather than infer it from administrative records.</w:t>
+      </w:r>
+    </w:p>
+    <w:p>
+      <w:r>
+        <w:t xml:space="preserve">Project evidence: </w:t>
+      </w:r>
+      <w:hyperlink r:id="rId10">
+        <w:r>
+          <w:rPr>
+            <w:color w:val="0563C1"/>
+            <w:u w:val="single"/>
+          </w:rPr>
+          <w:t>Assignment 5439 GitHub repository</w:t>
+        </w:r>
+      </w:hyperlink>
+    </w:p>
     <w:sectPr>
       <w:footerReference w:type="default" r:id="rId9"/>
       <w:pgSz w:w="12240" w:h="15840"/>

</xml_diff>